<commit_message>
curation: cover every book section; tiers scale with the chapter
- spine = CORE ideas, about one per substantial section, no fixed 3-7 cap
- every book section appears in the notebook (section-coverage table; the
  do-chapter gate and nbkit.save() both refuse a missing section)
- SKIP limited to history/repeats/exercises/deferred material, each with a
  one-line pointer in the notebook; nbkit gains note() and pointer()
- explainers stay <= 5, chosen from CORE ideas

Co-Authored-By: Claude Opus 5 (1M context) <noreply@anthropic.com>
Claude-Session: https://claude.ai/code/session_01LYdrYpQqxMewTZquuTwGaU
</commit_message>
<xml_diff>
--- a/GUIDE.docx
+++ b/GUIDE.docx
@@ -1411,7 +1411,7 @@
           <w:b/>
           <w:sz w:val="19"/>
         </w:rPr>
-        <w:t>Clicking beats coverage.</w:t>
+        <w:t>Cover everything; go deep where it clicks.</w:t>
       </w:r>
       <w:r>
         <w:rPr>
@@ -1430,7 +1430,7 @@
         <w:rPr>
           <w:sz w:val="19"/>
         </w:rPr>
-        <w:t xml:space="preserve"> in the chapter; the curator then picks the 3–7 ideas that</w:t>
+        <w:t xml:space="preserve"> in the chapter (every definition,</w:t>
       </w:r>
     </w:p>
     <w:p>
@@ -1438,7 +1438,352 @@
         <w:rPr>
           <w:sz w:val="19"/>
         </w:rPr>
-        <w:t>make the rest obvious, tiers every item (CORE / SUPPORT / NOTE / SKIP) and writes down what it leaves out and why that</w:t>
+        <w:t>theorem, numbered equation, example and figure). The curator then decides the depth of each item — the notebook covers</w:t>
+      </w:r>
+    </w:p>
+    <w:p>
+      <w:r>
+        <w:rPr>
+          <w:b/>
+          <w:sz w:val="19"/>
+        </w:rPr>
+        <w:t>every book section</w:t>
+      </w:r>
+      <w:r>
+        <w:rPr>
+          <w:sz w:val="19"/>
+        </w:rPr>
+        <w:t>:</w:t>
+      </w:r>
+    </w:p>
+    <w:tbl>
+      <w:tblPr>
+        <w:tblStyle w:val="TableGrid"/>
+        <w:tblW w:type="auto" w:w="0"/>
+        <w:tblLook w:firstColumn="1" w:firstRow="1" w:lastColumn="0" w:lastRow="0" w:noHBand="0" w:noVBand="1" w:val="04A0"/>
+      </w:tblPr>
+      <w:tblGrid>
+        <w:gridCol w:w="3360"/>
+        <w:gridCol w:w="3360"/>
+        <w:gridCol w:w="3360"/>
+      </w:tblGrid>
+      <w:tr>
+        <w:tc>
+          <w:tcPr>
+            <w:tcW w:type="dxa" w:w="3360"/>
+            <w:shd w:val="clear" w:color="auto" w:fill="1F3A5F"/>
+          </w:tcPr>
+          <w:p>
+            <w:pPr>
+              <w:spacing w:after="20"/>
+            </w:pPr>
+            <w:r/>
+            <w:r>
+              <w:rPr>
+                <w:b/>
+                <w:color w:val="FFFFFF"/>
+                <w:sz w:val="18"/>
+              </w:rPr>
+              <w:t>Tier</w:t>
+            </w:r>
+          </w:p>
+        </w:tc>
+        <w:tc>
+          <w:tcPr>
+            <w:tcW w:type="dxa" w:w="3360"/>
+            <w:shd w:val="clear" w:color="auto" w:fill="1F3A5F"/>
+          </w:tcPr>
+          <w:p>
+            <w:pPr>
+              <w:spacing w:after="20"/>
+            </w:pPr>
+            <w:r/>
+            <w:r>
+              <w:rPr>
+                <w:b/>
+                <w:color w:val="FFFFFF"/>
+                <w:sz w:val="18"/>
+              </w:rPr>
+              <w:t>Who gets it</w:t>
+            </w:r>
+          </w:p>
+        </w:tc>
+        <w:tc>
+          <w:tcPr>
+            <w:tcW w:type="dxa" w:w="3360"/>
+            <w:shd w:val="clear" w:color="auto" w:fill="1F3A5F"/>
+          </w:tcPr>
+          <w:p>
+            <w:pPr>
+              <w:spacing w:after="20"/>
+            </w:pPr>
+            <w:r/>
+            <w:r>
+              <w:rPr>
+                <w:b/>
+                <w:color w:val="FFFFFF"/>
+                <w:sz w:val="18"/>
+              </w:rPr>
+              <w:t>Treatment in the notebook</w:t>
+            </w:r>
+          </w:p>
+        </w:tc>
+      </w:tr>
+      <w:tr>
+        <w:tc>
+          <w:tcPr>
+            <w:tcW w:type="dxa" w:w="3360"/>
+          </w:tcPr>
+          <w:p>
+            <w:pPr>
+              <w:spacing w:after="20"/>
+            </w:pPr>
+            <w:r/>
+            <w:r>
+              <w:rPr>
+                <w:b/>
+                <w:sz w:val="18"/>
+              </w:rPr>
+              <w:t>CORE</w:t>
+            </w:r>
+          </w:p>
+        </w:tc>
+        <w:tc>
+          <w:tcPr>
+            <w:tcW w:type="dxa" w:w="3360"/>
+          </w:tcPr>
+          <w:p>
+            <w:pPr>
+              <w:spacing w:after="20"/>
+            </w:pPr>
+            <w:r/>
+            <w:r>
+              <w:rPr>
+                <w:sz w:val="18"/>
+              </w:rPr>
+              <w:t xml:space="preserve">the load-bearing ideas — roughly one per substantial section, </w:t>
+            </w:r>
+            <w:r>
+              <w:rPr>
+                <w:b/>
+                <w:sz w:val="18"/>
+              </w:rPr>
+              <w:t>no fixed cap</w:t>
+            </w:r>
+            <w:r>
+              <w:rPr>
+                <w:sz w:val="18"/>
+              </w:rPr>
+              <w:t xml:space="preserve"> (≈6 for Ch. 2, 10–14 for Ch. 4 or 13)</w:t>
+            </w:r>
+          </w:p>
+        </w:tc>
+        <w:tc>
+          <w:tcPr>
+            <w:tcW w:type="dxa" w:w="3360"/>
+          </w:tcPr>
+          <w:p>
+            <w:pPr>
+              <w:spacing w:after="20"/>
+            </w:pPr>
+            <w:r/>
+            <w:r>
+              <w:rPr>
+                <w:sz w:val="18"/>
+              </w:rPr>
+              <w:t>plain words → maths step by step → tiny example with easy numbers → commented code → figure/animation/plotly slider → possibly an explainer; ≥ 2 kinds of test evidence</w:t>
+            </w:r>
+          </w:p>
+        </w:tc>
+      </w:tr>
+      <w:tr>
+        <w:tc>
+          <w:tcPr>
+            <w:tcW w:type="dxa" w:w="3360"/>
+          </w:tcPr>
+          <w:p>
+            <w:pPr>
+              <w:spacing w:after="20"/>
+            </w:pPr>
+            <w:r/>
+            <w:r>
+              <w:rPr>
+                <w:b/>
+                <w:sz w:val="18"/>
+              </w:rPr>
+              <w:t>SUPPORT</w:t>
+            </w:r>
+          </w:p>
+        </w:tc>
+        <w:tc>
+          <w:tcPr>
+            <w:tcW w:type="dxa" w:w="3360"/>
+          </w:tcPr>
+          <w:p>
+            <w:pPr>
+              <w:spacing w:after="20"/>
+            </w:pPr>
+            <w:r/>
+            <w:r>
+              <w:rPr>
+                <w:sz w:val="18"/>
+              </w:rPr>
+              <w:t>ideas a CORE idea needs, or important in their own right</w:t>
+            </w:r>
+          </w:p>
+        </w:tc>
+        <w:tc>
+          <w:tcPr>
+            <w:tcW w:type="dxa" w:w="3360"/>
+          </w:tcPr>
+          <w:p>
+            <w:pPr>
+              <w:spacing w:after="20"/>
+            </w:pPr>
+            <w:r/>
+            <w:r>
+              <w:rPr>
+                <w:sz w:val="18"/>
+              </w:rPr>
+              <w:t>short explanation, the equation explained, code, a figure if it helps; ≥ 1 test</w:t>
+            </w:r>
+          </w:p>
+        </w:tc>
+      </w:tr>
+      <w:tr>
+        <w:tc>
+          <w:tcPr>
+            <w:tcW w:type="dxa" w:w="3360"/>
+          </w:tcPr>
+          <w:p>
+            <w:pPr>
+              <w:spacing w:after="20"/>
+            </w:pPr>
+            <w:r/>
+            <w:r>
+              <w:rPr>
+                <w:b/>
+                <w:sz w:val="18"/>
+              </w:rPr>
+              <w:t>NOTE</w:t>
+            </w:r>
+          </w:p>
+        </w:tc>
+        <w:tc>
+          <w:tcPr>
+            <w:tcW w:type="dxa" w:w="3360"/>
+          </w:tcPr>
+          <w:p>
+            <w:pPr>
+              <w:spacing w:after="20"/>
+            </w:pPr>
+            <w:r/>
+            <w:r>
+              <w:rPr>
+                <w:sz w:val="18"/>
+              </w:rPr>
+              <w:t>everything else worth knowing</w:t>
+            </w:r>
+          </w:p>
+        </w:tc>
+        <w:tc>
+          <w:tcPr>
+            <w:tcW w:type="dxa" w:w="3360"/>
+          </w:tcPr>
+          <w:p>
+            <w:pPr>
+              <w:spacing w:after="20"/>
+            </w:pPr>
+            <w:r/>
+            <w:r>
+              <w:rPr>
+                <w:sz w:val="18"/>
+              </w:rPr>
+              <w:t>a short paragraph in our words with the equation displayed and its number</w:t>
+            </w:r>
+          </w:p>
+        </w:tc>
+      </w:tr>
+      <w:tr>
+        <w:tc>
+          <w:tcPr>
+            <w:tcW w:type="dxa" w:w="3360"/>
+          </w:tcPr>
+          <w:p>
+            <w:pPr>
+              <w:spacing w:after="20"/>
+            </w:pPr>
+            <w:r/>
+            <w:r>
+              <w:rPr>
+                <w:b/>
+                <w:sz w:val="18"/>
+              </w:rPr>
+              <w:t>SKIP</w:t>
+            </w:r>
+          </w:p>
+        </w:tc>
+        <w:tc>
+          <w:tcPr>
+            <w:tcW w:type="dxa" w:w="3360"/>
+          </w:tcPr>
+          <w:p>
+            <w:pPr>
+              <w:spacing w:after="20"/>
+            </w:pPr>
+            <w:r/>
+            <w:r>
+              <w:rPr>
+                <w:sz w:val="18"/>
+              </w:rPr>
+              <w:t>only history, pure repeats, exercises, material the book defers to a later chapter</w:t>
+            </w:r>
+          </w:p>
+        </w:tc>
+        <w:tc>
+          <w:tcPr>
+            <w:tcW w:type="dxa" w:w="3360"/>
+          </w:tcPr>
+          <w:p>
+            <w:pPr>
+              <w:spacing w:after="20"/>
+            </w:pPr>
+            <w:r/>
+            <w:r>
+              <w:rPr>
+                <w:sz w:val="18"/>
+              </w:rPr>
+              <w:t>still one line in its section saying where the idea is covered</w:t>
+            </w:r>
+          </w:p>
+        </w:tc>
+      </w:tr>
+    </w:tbl>
+    <w:p>
+      <w:pPr>
+        <w:spacing w:after="40"/>
+      </w:pPr>
+    </w:p>
+    <w:p>
+      <w:r>
+        <w:rPr>
+          <w:sz w:val="19"/>
+        </w:rPr>
+        <w:t xml:space="preserve">A section-coverage table in </w:t>
+      </w:r>
+      <w:r>
+        <w:rPr>
+          <w:rFonts w:ascii="Consolas" w:hAnsi="Consolas"/>
+          <w:sz w:val="18"/>
+          <w:shd w:val="clear" w:color="auto" w:fill="EEEEEE"/>
+        </w:rPr>
+        <w:t>analysis/chNN_curation.md</w:t>
+      </w:r>
+      <w:r>
+        <w:rPr>
+          <w:sz w:val="19"/>
+        </w:rPr>
+        <w:t xml:space="preserve"> shows every book section and where it is taught; the</w:t>
       </w:r>
     </w:p>
     <w:p>
@@ -1446,7 +1791,23 @@
         <w:rPr>
           <w:sz w:val="19"/>
         </w:rPr>
-        <w:t>is safe. Explainers are reserved for CORE ideas where manipulation or motion teaches what a static figure cannot.</w:t>
+        <w:t>orchestrator refuses a curation with an empty section, and the notebook kit refuses to save a notebook that misses one.</w:t>
+      </w:r>
+    </w:p>
+    <w:p>
+      <w:r>
+        <w:rPr>
+          <w:sz w:val="19"/>
+        </w:rPr>
+        <w:t>The ≤ 5 explainers are chosen from the CORE ideas where manipulation or motion teaches what a static figure cannot; the</w:t>
+      </w:r>
+    </w:p>
+    <w:p>
+      <w:r>
+        <w:rPr>
+          <w:sz w:val="19"/>
+        </w:rPr>
+        <w:t>other CORE and SUPPORT ideas get figures, animations and plotly sliders.</w:t>
       </w:r>
     </w:p>
     <w:p>
@@ -2574,7 +2935,7 @@
               <w:rPr>
                 <w:sz w:val="18"/>
               </w:rPr>
-              <w:t>the teaching spine, the explainer shortlist with each "aha", the left-out list</w:t>
+              <w:t>the teaching spine, the count per tier, the section-coverage table, the explainer shortlist with each "aha", the SKIP list with pointers</w:t>
             </w:r>
           </w:p>
         </w:tc>
@@ -3588,7 +3949,7 @@
         <w:rPr>
           <w:sz w:val="19"/>
         </w:rPr>
-        <w:t>Gates: analysis covers every numbered equation · ≤ 5 explainers with reasons · every design function exists · tests</w:t>
+        <w:t>Gates: analysis covers every numbered equation · every item tiered and every book section covered (no empty section) · ≤ 5 explainers with reasons · every design function exists · tests</w:t>
       </w:r>
     </w:p>
     <w:p>
@@ -6298,7 +6659,7 @@
               <w:rPr>
                 <w:sz w:val="18"/>
               </w:rPr>
-              <w:t>teaching spine, tiers, ≤5 explainers, animations, interactives, left-out list</w:t>
+              <w:t>tiers for every item, teaching spine, section coverage, ≤5 explainers, animations, interactives, SKIP pointers</w:t>
             </w:r>
           </w:p>
         </w:tc>

</xml_diff>